<commit_message>
docs: Update manual - remove company references
</commit_message>
<xml_diff>
--- a/MANUAL.docx
+++ b/MANUAL.docx
@@ -13,7 +13,7 @@
           <w:b/>
           <w:bCs/>
         </w:rPr>
-        <w:t xml:space="preserve">쿠팡 가격관리 시스템</w:t>
+        <w:t xml:space="preserve">C사 가격관리 시스템</w:t>
       </w:r>
     </w:p>
     <w:p>
@@ -330,7 +330,7 @@
                 <w:sz w:val="20"/>
                 <w:szCs w:val="20"/>
               </w:rPr>
-              <w:t xml:space="preserve">대표님 (테라바이오텍코리아)</w:t>
+              <w:t xml:space="preserve">BonScience</w:t>
             </w:r>
           </w:p>
         </w:tc>
@@ -379,7 +379,7 @@
           <w:sz w:val="22"/>
           <w:szCs w:val="22"/>
         </w:rPr>
-        <w:t xml:space="preserve">쿠팡에서 판매하는 본사이언스 제품의 가격을 경쟁사 대비 자동으로 관리하는 시스템입니다. 경쟁사 가격을 주기적으로 크롤링하고, 설정된 가격 전략에 따라 즉시할인쿠폰을 자동 발행합니다.</w:t>
+        <w:t xml:space="preserve">C사에서 판매하는 자사 제품의 가격을 경쟁사 대비 자동으로 관리하는 시스템입니다. 경쟁사 가격을 주기적으로 크롤링하고, 설정된 가격 전략에 따라 즉시할인쿠폰을 자동 발행합니다.</w:t>
       </w:r>
     </w:p>
     <w:p>
@@ -721,7 +721,7 @@
                 <w:sz w:val="20"/>
                 <w:szCs w:val="20"/>
               </w:rPr>
-              <w:t xml:space="preserve">고정 IP (34.22.68.152)로 쿠팡 WING API 호출. IP 등록 필수.</w:t>
+              <w:t xml:space="preserve">고정 IP (34.22.68.152)로 C사 WING API 호출. IP 등록 필수.</w:t>
             </w:r>
           </w:p>
         </w:tc>
@@ -1131,7 +1131,7 @@
                 <w:sz w:val="20"/>
                 <w:szCs w:val="20"/>
               </w:rPr>
-              <w:t xml:space="preserve">쿠팡 봇 차단 우회. 무료 5,000건 (약 27개월분). 하루 6크레딧 소모.</w:t>
+              <w:t xml:space="preserve">C사 봇 차단 우회. 무료 5,000건 (약 27개월분). 하루 6크레딧 소모.</w:t>
             </w:r>
           </w:p>
         </w:tc>
@@ -1616,7 +1616,7 @@
                 <w:sz w:val="20"/>
                 <w:szCs w:val="20"/>
               </w:rPr>
-              <w:t xml:space="preserve">34.22.68.152 (쿠팡 WING에 등록됨)</w:t>
+              <w:t xml:space="preserve">34.22.68.152 (C사 WING에 등록됨)</w:t>
             </w:r>
           </w:p>
         </w:tc>
@@ -1852,7 +1852,7 @@
           <w:sz w:val="22"/>
           <w:szCs w:val="22"/>
         </w:rPr>
-        <w:t xml:space="preserve">경쟁사 가격 크롤링 (ScraperAPI → 쿠팡 페이지)</w:t>
+        <w:t xml:space="preserve">경쟁사 가격 크롤링 (ScraperAPI → C사 페이지)</w:t>
       </w:r>
     </w:p>
     <w:p>
@@ -1906,7 +1906,7 @@
           <w:sz w:val="22"/>
           <w:szCs w:val="22"/>
         </w:rPr>
-        <w:t xml:space="preserve">WING API로 실제 쿠팡 판매가 조회 (get_inventory)</w:t>
+        <w:t xml:space="preserve">WING API로 실제 C사 판매가 조회 (get_inventory)</w:t>
       </w:r>
     </w:p>
     <w:p>
@@ -2138,7 +2138,7 @@
           <w:sz w:val="22"/>
           <w:szCs w:val="22"/>
         </w:rPr>
-        <w:t xml:space="preserve">할인금액 = 쿠팡 실제 판매가 - 목표가 (config의 original_price가 아닌 WING API 조회값 사용)</w:t>
+        <w:t xml:space="preserve">할인금액 = C사 실제 판매가 - 목표가 (config의 original_price가 아닌 WING API 조회값 사용)</w:t>
       </w:r>
     </w:p>
     <w:p>
@@ -2257,7 +2257,7 @@
           <w:sz w:val="22"/>
           <w:szCs w:val="22"/>
         </w:rPr>
-        <w:t xml:space="preserve">고정 쿠폰이 상품을 잡고 있어서 새 쿠폰 연결이 안 되면, [CIR08] 에러가 발생하고 잔디로 빨간 알림이 갑니다. 이 경우 쿠팡 WING에서 수동으로 해당 상품을 해제해야 합니다.</w:t>
+        <w:t xml:space="preserve">고정 쿠폰이 상품을 잡고 있어서 새 쿠폰 연결이 안 되면, [CIR08] 에러가 발생하고 잔디로 빨간 알림이 갑니다. 이 경우 C사 WING에서 수동으로 해당 상품을 해제해야 합니다.</w:t>
       </w:r>
     </w:p>
     <w:p>
@@ -4806,7 +4806,7 @@
                 <w:sz w:val="20"/>
                 <w:szCs w:val="20"/>
               </w:rPr>
-              <w:t xml:space="preserve">WING API로 실제 쿠팡 판매가 조회 + config 업데이트</w:t>
+              <w:t xml:space="preserve">WING API로 실제 C사 판매가 조회 + config 업데이트</w:t>
             </w:r>
           </w:p>
         </w:tc>
@@ -4876,7 +4876,7 @@
                 <w:sz w:val="20"/>
                 <w:szCs w:val="20"/>
               </w:rPr>
-              <w:t xml:space="preserve">쿠팡 정가(취소선 가격) 변경</w:t>
+              <w:t xml:space="preserve">C사 정가(취소선 가격) 변경</w:t>
             </w:r>
           </w:p>
         </w:tc>
@@ -5082,7 +5082,7 @@
                 <w:sz w:val="20"/>
                 <w:szCs w:val="20"/>
               </w:rPr>
-              <w:t xml:space="preserve">현재 활성 쿠폰 목록 (쿠팡 WING 조회)</w:t>
+              <w:t xml:space="preserve">현재 활성 쿠폰 목록 (C사 WING 조회)</w:t>
             </w:r>
           </w:p>
         </w:tc>
@@ -5269,7 +5269,7 @@
           <w:sz w:val="22"/>
           <w:szCs w:val="22"/>
         </w:rPr>
-        <w:t xml:space="preserve">원인: 해당 상품이 이미 다른 쿠폰에 연결되어 있음. 쿠팡은 1상품 1쿠폰 규칙.</w:t>
+        <w:t xml:space="preserve">원인: 해당 상품이 이미 다른 쿠폰에 연결되어 있음. C사는 1상품 1쿠폰 규칙.</w:t>
       </w:r>
     </w:p>
     <w:p>

</xml_diff>